<commit_message>
Add week 5 homework
</commit_message>
<xml_diff>
--- a/day04/NUMPY ARRAYS.docx
+++ b/day04/NUMPY ARRAYS.docx
@@ -27,7 +27,7 @@
           <w:szCs w:val="26"/>
           <w14:ligatures w14:val="none"/>
         </w:rPr>
-        <w:t>NUMPY ARRAYS — PRACTICE EXERCISES</w:t>
+        <w:t>NUMPYARRAYS — PRACTICE EXERCISES</w:t>
       </w:r>
     </w:p>
     <w:p>
@@ -311,7 +311,7 @@
           <w:szCs w:val="26"/>
         </w:rPr>
         <w:pict w14:anchorId="1C8E6986">
-          <v:rect id="_x0000_i1027" alt="" style="width:468pt;height:.05pt;mso-width-percent:0;mso-height-percent:0;mso-width-percent:0;mso-height-percent:0" o:hralign="center" o:hrstd="t" o:hr="t" fillcolor="#a0a0a0" stroked="f"/>
+          <v:rect id="_x0000_i1025" alt="" style="width:468pt;height:.05pt;mso-width-percent:0;mso-height-percent:0;mso-width-percent:0;mso-height-percent:0" o:hralign="center" o:hrstd="t" o:hr="t" fillcolor="#a0a0a0" stroked="f"/>
         </w:pict>
       </w:r>
     </w:p>
@@ -1063,6 +1063,7 @@
           <w:kern w:val="0"/>
           <w:sz w:val="26"/>
           <w:szCs w:val="26"/>
+          <w:lang w:val="en-US"/>
           <w14:ligatures w14:val="none"/>
         </w:rPr>
       </w:pPr>
@@ -4583,7 +4584,7 @@
           <w:szCs w:val="26"/>
         </w:rPr>
         <w:pict w14:anchorId="3C766CE2">
-          <v:rect id="_x0000_i1025" alt="" style="width:468pt;height:.05pt;mso-width-percent:0;mso-height-percent:0;mso-width-percent:0;mso-height-percent:0" o:hralign="center" o:hrstd="t" o:hr="t" fillcolor="#a0a0a0" stroked="f"/>
+          <v:rect id="_x0000_i1027" alt="" style="width:468pt;height:.05pt;mso-width-percent:0;mso-height-percent:0;mso-width-percent:0;mso-height-percent:0" o:hralign="center" o:hrstd="t" o:hr="t" fillcolor="#a0a0a0" stroked="f"/>
         </w:pict>
       </w:r>
     </w:p>
@@ -6450,7 +6451,7 @@
         <w:kern w:val="2"/>
         <w:sz w:val="24"/>
         <w:szCs w:val="24"/>
-        <w:lang w:val="en-VN" w:eastAsia="en-US" w:bidi="ar-SA"/>
+        <w:lang w:eastAsia="en-US" w:bidi="ar-SA"/>
         <w14:ligatures w14:val="standardContextual"/>
       </w:rPr>
     </w:rPrDefault>

</xml_diff>